<commit_message>
v2.2.3 — Gamma = 1, two sectors completed, and the boundary drawn from four directions
</commit_message>
<xml_diff>
--- a/papers/_sources/rope_electricity.docx
+++ b/papers/_sources/rope_electricity.docx
@@ -1430,20 +1430,61 @@
       </w:r>
     </w:p>
     <w:p>
+      <w:r>
+        <w:rPr>
+          <w:b/>
+        </w:rPr>
+        <w:t xml:space="preserve">5.  Current as Transported Linking</w:t>
+      </w:r>
+    </w:p>
+    <w:p>
+      <w:r>
+        <w:t xml:space="preserve">If static charge is a linking number (Section 1), then electric current is what happens when that linking is set in motion. In the two-strand picture the conductor is a helix, and rotating the helix about its own axis — the screw sense of the winding — transports linking along the wire without creating or destroying it. Current is therefore not a new primitive but the FLUX of the already-established topological charge: the rate at which linking crosses a section of the rope.</w:t>
+      </w:r>
+    </w:p>
+    <w:p>
+      <w:r>
+        <w:t xml:space="preserve">This identification carries a built-in conservation law. Because linking number is a topological integer that the strand mechanics cannot spontaneously wind up or unwind, three statements that are separate axioms in textbook electromagnetism collapse into ONE condition here: charge is conserved, the current density is divergence-free in steady state (∇·J = 0), and steady currents must close in loops. They are the same fact — that linking is transported, not generated — viewed three ways. This is the content of the continuity result (EM-008), machine-checked in benchmarks/em/current_continuity.py.</w:t>
+      </w:r>
+    </w:p>
+    <w:p>
+      <w:r>
+        <w:t xml:space="preserve">The helix screw-sense also fixes the TYPE AND SIGN of circulation: which way the linking flows for a given winding handedness, and that the rotation delivers power consistently with the continuity condition (EM-009 Modeled, EM-014 Derived; benchmarks/em/helix_circulation.py, screw_current.py). What the screw picture does not by itself supply is the dynamical DRIVE — what sets the helix rotating — which is the role of voltage, the subject of the next section. Current is the transported invariant; voltage is what transports it.</w:t>
+      </w:r>
+    </w:p>
+    <w:p>
+      <w:r>
+        <w:rPr>
+          <w:b/>
+        </w:rPr>
+        <w:t xml:space="preserve">6.  Voltage as the Tension Field</w:t>
+      </w:r>
+    </w:p>
+    <w:p>
+      <w:r>
+        <w:t xml:space="preserve">Charge and current are topological — integer linking, and its flux. Voltage is not. In the rope framework the electric potential is the LONGITUDINAL TENSION FIELD of the strands: a difference in potential is a difference in the rope's tension state, and it is tension gradients that drive the screw rotation carrying current. This is why voltage cannot be read off a linking number — it lives in a different layer of the mechanics, the tension of the medium rather than the topology threading it.</w:t>
+      </w:r>
+    </w:p>
+    <w:p>
+      <w:r>
+        <w:t xml:space="preserve">This places the three familiar quantities of a circuit on three distinct mechanical footings: CHARGE is the linking number (an integer topological invariant); CURRENT is transported linking (its flux, delivered by the screw mechanism); VOLTAGE is the tension field (the longitudinal state of the strands whose gradient drives the transport). The complete correspondence — how the mechanical state of the tensioned two-strand rope maps onto the scalar and vector potentials (φ, A), the field tensor Fμν, the fields (E, B), and back to Maxwell and the Lorentz force, with both electrostatic and magnetostatic sign rules — is assembled as the field-tensor dictionary (EM-016 Modeled; benchmarks/em/electrostatic_sign_derivation.py). The scalar potential φ is the tension identification used here; the vector potential A is the helical pitch state that encodes current.</w:t>
+      </w:r>
+    </w:p>
+    <w:p>
+      <w:r>
+        <w:t xml:space="preserve">A note on completeness, in the corpus's usual spirit. The tension-field identification of potential is Modeled, not a zero-assumption derivation: it fixes the FORM and the SIGNS by energy and geometry, with the overall field/strain calibration carried as a Modeled identification (EM-016). What the section establishes is that current and voltage are not afterthoughts to a charge-only theory but distinct, mechanically grounded quantities — the transported invariant and the field that drives it — completing electricity as a three-quantity account rather than a one-quantity one.</w:t>
+      </w:r>
+    </w:p>
+    <w:p>
       <w:pPr>
         <w:pStyle w:val="Heading1"/>
         <w:spacing w:after="140" w:before="320"/>
       </w:pPr>
       <w:r>
         <w:rPr>
-          <w:rFonts w:ascii="Times New Roman" w:cs="Times New Roman" w:eastAsia="Times New Roman" w:hAnsi="Times New Roman"/>
           <w:b/>
-          <w:bCs/>
-          <w:color w:val="1F3864"/>
-          <w:sz w:val="28"/>
-          <w:szCs w:val="28"/>
-        </w:rPr>
-        <w:t xml:space="preserve">5.  Status of Each Result</w:t>
+        </w:rPr>
+        <w:t>7.  Status of Each Result</w:t>
       </w:r>
     </w:p>
     <w:tbl>
@@ -2053,6 +2094,38 @@
       </w:r>
       <w:r>
         <w:t>Fine-structure constant alpha from the impedance relation  [benchmark: benchmarks/em/em_structure.py]</w:t>
+      </w:r>
+    </w:p>
+    <w:p>
+      <w:r>
+        <w:rPr>
+          <w:b/>
+        </w:rPr>
+        <w:t xml:space="preserve">• EM-008 [Derived]: Current = transported linking; continuity ∇·J = 0  [benchmark: benchmarks/em/current_continuity.py]</w:t>
+      </w:r>
+    </w:p>
+    <w:p>
+      <w:r>
+        <w:rPr>
+          <w:b/>
+        </w:rPr>
+        <w:t xml:space="preserve">• EM-009 [Modeled]: Helix screw-sense sets circulation type and sign  [benchmark: benchmarks/em/helix_circulation.py]</w:t>
+      </w:r>
+    </w:p>
+    <w:p>
+      <w:r>
+        <w:rPr>
+          <w:b/>
+        </w:rPr>
+        <w:t xml:space="preserve">• EM-014 [Derived]: Screw mechanism transports linking and delivers power  [benchmark: benchmarks/em/screw_current.py]</w:t>
+      </w:r>
+    </w:p>
+    <w:p>
+      <w:r>
+        <w:rPr>
+          <w:b/>
+        </w:rPr>
+        <w:t xml:space="preserve">• EM-016 [Modeled]: Field-tensor dictionary — potentials, Fμν, (E,B), voltage as tension  [benchmark: benchmarks/em/electrostatic_sign_derivation.py]</w:t>
       </w:r>
     </w:p>
     <w:p>

</xml_diff>